<commit_message>
feat: Phase 1-7 complete - login auth, RBAC, cache, warm UI, server deploy
</commit_message>
<xml_diff>
--- a/跨境海外仓供应链智能决策系统_项目汇报.docx
+++ b/跨境海外仓供应链智能决策系统_项目汇报.docx
@@ -3258,6 +3258,268 @@
       </w:pPr>
       <w:r>
         <w:t>6. 实时监控预警：接入Webhook/企业微信，实现库存预警、物流异常的实时推送</w:t>
+      </w:r>
+    </w:p>
+    <w:p>
+      <w:r>
+        <w:br w:type="page"/>
+      </w:r>
+    </w:p>
+    <w:p>
+      <w:pPr>
+        <w:pStyle w:val="3"/>
+      </w:pPr>
+      <w:r>
+        <w:t>附件：前端UI优化与性能优化迭代记录（Phase 1-7）</w:t>
+      </w:r>
+    </w:p>
+    <w:p>
+      <w:pPr>
+        <w:pStyle w:val="4"/>
+      </w:pPr>
+      <w:r>
+        <w:t>Phase 1：全局样式+导航栏升级</w:t>
+      </w:r>
+    </w:p>
+    <w:p>
+      <w:r>
+        <w:rPr>
+          <w:b/>
+        </w:rPr>
+        <w:t>侧边栏宽度：</w:t>
+      </w:r>
+      <w:r>
+        <w:t>默认180px → 加宽至225-230px，适配大卡片导航按钮</w:t>
+      </w:r>
+    </w:p>
+    <w:p>
+      <w:r>
+        <w:rPr>
+          <w:b/>
+        </w:rPr>
+        <w:t>导航按钮样式：</w:t>
+      </w:r>
+      <w:r>
+        <w:t>默认Radio → 大卡片样式（渐变背景+左侧竖条+悬停动效+选中态白色竖条）</w:t>
+      </w:r>
+    </w:p>
+    <w:p>
+      <w:r>
+        <w:rPr>
+          <w:b/>
+        </w:rPr>
+        <w:t>导航分组：</w:t>
+      </w:r>
+      <w:r>
+        <w:t>核心运营 / 物流调度 / 系统管理 三大分组，标题居中+两侧装饰线</w:t>
+      </w:r>
+    </w:p>
+    <w:p>
+      <w:r>
+        <w:rPr>
+          <w:b/>
+        </w:rPr>
+        <w:t>Logo区域：</w:t>
+      </w:r>
+      <w:r>
+        <w:t>深蓝渐变卡片+品牌名+版本号 SC-Decision Engine v1.0</w:t>
+      </w:r>
+    </w:p>
+    <w:p>
+      <w:r>
+        <w:rPr>
+          <w:b/>
+        </w:rPr>
+        <w:t>CSS选择器策略：</w:t>
+      </w:r>
+      <w:r>
+        <w:t>从父子选择器改为直接选择器 [data-testid="stSidebar"] button，解决Streamlit组件独立渲染问题</w:t>
+      </w:r>
+    </w:p>
+    <w:p>
+      <w:pPr>
+        <w:pStyle w:val="4"/>
+      </w:pPr>
+      <w:r>
+        <w:t>Phase 2：首页Dashboard+数据可视化升级</w:t>
+      </w:r>
+    </w:p>
+    <w:p>
+      <w:r>
+        <w:rPr>
+          <w:b/>
+        </w:rPr>
+        <w:t>KPI卡片：</w:t>
+      </w:r>
+      <w:r>
+        <w:t>新增左侧4px彩色竖条+图标背景+阴影悬停效果</w:t>
+      </w:r>
+    </w:p>
+    <w:p>
+      <w:r>
+        <w:rPr>
+          <w:b/>
+        </w:rPr>
+        <w:t>图表容器：</w:t>
+      </w:r>
+      <w:r>
+        <w:t>统一圆角12px+阴影+悬停放大</w:t>
+      </w:r>
+    </w:p>
+    <w:p>
+      <w:r>
+        <w:rPr>
+          <w:b/>
+        </w:rPr>
+        <w:t>Plotly主题统一：</w:t>
+      </w:r>
+      <w:r>
+        <w:t>字体/边距/网格线/图例位置标准化</w:t>
+      </w:r>
+    </w:p>
+    <w:p>
+      <w:pPr>
+        <w:pStyle w:val="4"/>
+      </w:pPr>
+      <w:r>
+        <w:t>Phase 3-5：各页面标题+内容区域升级</w:t>
+      </w:r>
+    </w:p>
+    <w:p>
+      <w:r>
+        <w:rPr>
+          <w:b/>
+        </w:rPr>
+        <w:t>统一标题样式：</w:t>
+      </w:r>
+      <w:r>
+        <w:t>白色卡片+左侧4px竖条+右侧大图标，替代默认st.title()</w:t>
+      </w:r>
+    </w:p>
+    <w:p>
+      <w:r>
+        <w:rPr>
+          <w:b/>
+        </w:rPr>
+        <w:t>Phase 3：</w:t>
+      </w:r>
+      <w:r>
+        <w:t>需求预测（预测趋势图+MAPE分布+TOP10排名）+ 补货计划（补货量对比+SKU明细）</w:t>
+      </w:r>
+    </w:p>
+    <w:p>
+      <w:r>
+        <w:rPr>
+          <w:b/>
+        </w:rPr>
+        <w:t>Phase 4：</w:t>
+      </w:r>
+      <w:r>
+        <w:t>库存监控（ABC-XYZ散点图+库龄分布+预警表格）+ 调拨建议（优先级柱状图+热力图）+ 采购物流（状态漏斗+在途饼图）</w:t>
+      </w:r>
+    </w:p>
+    <w:p>
+      <w:r>
+        <w:rPr>
+          <w:b/>
+        </w:rPr>
+        <w:t>Phase 5：</w:t>
+      </w:r>
+      <w:r>
+        <w:t>使用指南（操作手册下载+导航卡片+系统亮点）+ 运维中心（管理员登录+问题反馈+工单管理+通知发布）</w:t>
+      </w:r>
+    </w:p>
+    <w:p>
+      <w:pPr>
+        <w:pStyle w:val="4"/>
+      </w:pPr>
+      <w:r>
+        <w:t>Phase 6：登录验证系统（权限控制）</w:t>
+      </w:r>
+    </w:p>
+    <w:p>
+      <w:r>
+        <w:rPr>
+          <w:b/>
+        </w:rPr>
+        <w:t>登录页面：</w:t>
+      </w:r>
+      <w:r>
+        <w:t>左侧蓝白渐变装饰区+右侧登录表单，未登录时CSS隐藏侧边栏</w:t>
+      </w:r>
+    </w:p>
+    <w:p>
+      <w:r>
+        <w:rPr>
+          <w:b/>
+        </w:rPr>
+        <w:t>预置账户：</w:t>
+      </w:r>
+      <w:r>
+        <w:t>admin（全权限）/ planner（无运维中心）/ viewer（仅首页+使用指南）</w:t>
+      </w:r>
+    </w:p>
+    <w:p>
+      <w:r>
+        <w:rPr>
+          <w:b/>
+        </w:rPr>
+        <w:t>权限过滤：</w:t>
+      </w:r>
+      <w:r>
+        <w:t>基于ROLE_PERMISSIONS字典，在导航渲染时动态过滤可见页面</w:t>
+      </w:r>
+    </w:p>
+    <w:p>
+      <w:r>
+        <w:rPr>
+          <w:b/>
+        </w:rPr>
+        <w:t>退出登录：</w:t>
+      </w:r>
+      <w:r>
+        <w:t>导航栏显示用户卡片（头像+用户名+角色）+ "🚪 退出"按钮，一键清除session_state</w:t>
+      </w:r>
+    </w:p>
+    <w:p>
+      <w:pPr>
+        <w:pStyle w:val="4"/>
+      </w:pPr>
+      <w:r>
+        <w:t>Phase 7：性能测试与优化</w:t>
+      </w:r>
+    </w:p>
+    <w:p>
+      <w:r>
+        <w:rPr>
+          <w:b/>
+        </w:rPr>
+        <w:t>数据缓存：</w:t>
+      </w:r>
+      <w:r>
+        <w:t>st.cache_data(ttl=300) 包装所有数据加载函数，缓存时间5分钟，减少重复文件读取</w:t>
+      </w:r>
+    </w:p>
+    <w:p>
+      <w:r>
+        <w:rPr>
+          <w:b/>
+        </w:rPr>
+        <w:t>KPI计算缓存：</w:t>
+      </w:r>
+      <w:r>
+        <w:t>st.cache_data(ttl=60) 缓存 compute_kpis()，减少频繁计算</w:t>
+      </w:r>
+    </w:p>
+    <w:p>
+      <w:r>
+        <w:rPr>
+          <w:b/>
+        </w:rPr>
+        <w:t>并发压测：</w:t>
+      </w:r>
+      <w:r>
+        <w:t>Locust脚本模拟50用户并发，首页访问权重3/预测页权重2/补货页权重1，持续60秒，输出响应时间报告</w:t>
       </w:r>
     </w:p>
     <w:sectPr>

</xml_diff>